<commit_message>
Traduz exemplo de herança para português
</commit_message>
<xml_diff>
--- a/POO1/HerancaJS/anotacoes.docx
+++ b/POO1/HerancaJS/anotacoes.docx
@@ -71,7 +71,17 @@
       </w:r>
       <w:r>
         <w:rPr/>
-        <w:t xml:space="preserve">. Implementei e executei o exemplo adaptado com </w:t>
+        <w:t xml:space="preserve">. No código traduzido, </w:t>
+      </w:r>
+      <w:r>
+        <w:rPr>
+          <w:rStyle w:val="SourceText"/>
+        </w:rPr>
+        <w:t>Pessoa</w:t>
+      </w:r>
+      <w:r>
+        <w:rPr/>
+        <w:t xml:space="preserve"> equivale a </w:t>
       </w:r>
       <w:r>
         <w:rPr>
@@ -87,17 +97,27 @@
         <w:rPr>
           <w:rStyle w:val="SourceText"/>
         </w:rPr>
+        <w:t>Professor</w:t>
+      </w:r>
+      <w:r>
+        <w:rPr/>
+        <w:t xml:space="preserve"> equivale a </w:t>
+      </w:r>
+      <w:r>
+        <w:rPr>
+          <w:rStyle w:val="SourceText"/>
+        </w:rPr>
         <w:t>Teacher</w:t>
       </w:r>
       <w:r>
         <w:rPr/>
-        <w:t xml:space="preserve">. </w:t>
-      </w:r>
-      <w:r>
-        <w:rPr>
-          <w:rStyle w:val="SourceText"/>
-        </w:rPr>
-        <w:t>Teacher extends Person</w:t>
+        <w:t xml:space="preserve"> da MDN. </w:t>
+      </w:r>
+      <w:r>
+        <w:rPr>
+          <w:rStyle w:val="SourceText"/>
+        </w:rPr>
+        <w:t>Professor extends Pessoa</w:t>
       </w:r>
       <w:r>
         <w:rPr/>
@@ -107,7 +127,7 @@
         <w:rPr>
           <w:rStyle w:val="SourceText"/>
         </w:rPr>
-        <w:t>super(first, last, age, gender, interests)</w:t>
+        <w:t>super(...)</w:t>
       </w:r>
       <w:r>
         <w:rPr/>
@@ -117,7 +137,7 @@
         <w:rPr>
           <w:rStyle w:val="SourceText"/>
         </w:rPr>
-        <w:t>subject</w:t>
+        <w:t>disciplina</w:t>
       </w:r>
       <w:r>
         <w:rPr/>
@@ -127,27 +147,17 @@
         <w:rPr>
           <w:rStyle w:val="SourceText"/>
         </w:rPr>
-        <w:t>grade</w:t>
-      </w:r>
-      <w:r>
-        <w:rPr/>
-        <w:t xml:space="preserve">. O objeto </w:t>
-      </w:r>
-      <w:r>
-        <w:rPr>
-          <w:rStyle w:val="SourceText"/>
-        </w:rPr>
-        <w:t>snape</w:t>
-      </w:r>
-      <w:r>
-        <w:rPr/>
-        <w:t xml:space="preserve"> produziu: “Hi! I'm Severus”, “Severus has left the building. Bye for now!”, “Idade: 58; matéria inicial: Dark arts”. Também implementei </w:t>
-      </w:r>
-      <w:r>
-        <w:rPr>
-          <w:rStyle w:val="SourceText"/>
-        </w:rPr>
-        <w:t>get subject()</w:t>
+        <w:t>serie</w:t>
+      </w:r>
+      <w:r>
+        <w:rPr/>
+        <w:t xml:space="preserve">. Os métodos foram traduzidos para </w:t>
+      </w:r>
+      <w:r>
+        <w:rPr>
+          <w:rStyle w:val="SourceText"/>
+        </w:rPr>
+        <w:t>cumprimentar()</w:t>
       </w:r>
       <w:r>
         <w:rPr/>
@@ -157,21 +167,31 @@
         <w:rPr>
           <w:rStyle w:val="SourceText"/>
         </w:rPr>
-        <w:t>set subject()</w:t>
-      </w:r>
-      <w:r>
-        <w:rPr/>
-        <w:t xml:space="preserve">: depois de </w:t>
-      </w:r>
-      <w:r>
-        <w:rPr>
-          <w:rStyle w:val="SourceText"/>
-        </w:rPr>
-        <w:t>snape.subject = "Balloon animals"</w:t>
-      </w:r>
-      <w:r>
-        <w:rPr/>
-        <w:t>, a saída foi “Matéria após o setter: Balloon animals”.</w:t>
+        <w:t>despedir()</w:t>
+      </w:r>
+      <w:r>
+        <w:rPr/>
+        <w:t xml:space="preserve">. Os objetos produziram: “Olá! Eu sou Han.”, “Leia foi embora. Até logo!”, “Olá! Eu sou Severus.”, “Severus foi embora. Até logo!” e “Idade: 58; disciplina inicial: Artes das Trevas”. Também implementei </w:t>
+      </w:r>
+      <w:r>
+        <w:rPr>
+          <w:rStyle w:val="SourceText"/>
+        </w:rPr>
+        <w:t>get disciplina()</w:t>
+      </w:r>
+      <w:r>
+        <w:rPr/>
+        <w:t xml:space="preserve"> e </w:t>
+      </w:r>
+      <w:r>
+        <w:rPr>
+          <w:rStyle w:val="SourceText"/>
+        </w:rPr>
+        <w:t>set disciplina()</w:t>
+      </w:r>
+      <w:r>
+        <w:rPr/>
+        <w:t>: após alterar a disciplina, a saída foi “Disciplina após alteração: Escultura de balões”.</w:t>
       </w:r>
     </w:p>
     <w:p>
@@ -319,23 +339,23 @@
       </w:r>
       <w:r>
         <w:rPr/>
-        <w:t xml:space="preserve"> chama o construtor da classe pai e inicializa seus atributos; o atributo público herdado </w:t>
-      </w:r>
-      <w:r>
-        <w:rPr>
-          <w:rStyle w:val="SourceText"/>
-        </w:rPr>
-        <w:t>age</w:t>
-      </w:r>
-      <w:r>
-        <w:rPr/>
-        <w:t xml:space="preserve"> é lido por </w:t>
-      </w:r>
-      <w:r>
-        <w:rPr>
-          <w:rStyle w:val="SourceText"/>
-        </w:rPr>
-        <w:t>snape.age</w:t>
+        <w:t xml:space="preserve"> chama o construtor da classe pai e inicializa seus atributos; a propriedade pública herdada </w:t>
+      </w:r>
+      <w:r>
+        <w:rPr>
+          <w:rStyle w:val="SourceText"/>
+        </w:rPr>
+        <w:t>idade</w:t>
+      </w:r>
+      <w:r>
+        <w:rPr/>
+        <w:t xml:space="preserve"> é lida por </w:t>
+      </w:r>
+      <w:r>
+        <w:rPr>
+          <w:rStyle w:val="SourceText"/>
+        </w:rPr>
+        <w:t>professor.idade</w:t>
       </w:r>
       <w:r>
         <w:rPr/>
@@ -345,7 +365,7 @@
         <w:rPr>
           <w:rStyle w:val="SourceText"/>
         </w:rPr>
-        <w:t>this.age</w:t>
+        <w:t>this.idade</w:t>
       </w:r>
       <w:r>
         <w:rPr/>

</xml_diff>